<commit_message>
birdsm builk Ports and running manually
</commit_message>
<xml_diff>
--- a/Birds.docx
+++ b/Birds.docx
@@ -1,6 +1,6 @@
 
 <file path=word/document.xml><?xml version="1.0" encoding="utf-8"?>
-<w:document xmlns:wpc="http://schemas.microsoft.com/office/word/2010/wordprocessingCanvas" xmlns:cx="http://schemas.microsoft.com/office/drawing/2014/chartex" xmlns:cx1="http://schemas.microsoft.com/office/drawing/2015/9/8/chartex" xmlns:cx2="http://schemas.microsoft.com/office/drawing/2015/10/21/chartex" xmlns:cx3="http://schemas.microsoft.com/office/drawing/2016/5/9/chartex" xmlns:cx4="http://schemas.microsoft.com/office/drawing/2016/5/10/chartex" xmlns:cx5="http://schemas.microsoft.com/office/drawing/2016/5/11/chartex" xmlns:cx6="http://schemas.microsoft.com/office/drawing/2016/5/12/chartex" xmlns:cx7="http://schemas.microsoft.com/office/drawing/2016/5/13/chartex" xmlns:cx8="http://schemas.microsoft.com/office/drawing/2016/5/14/chartex" xmlns:mc="http://schemas.openxmlformats.org/markup-compatibility/2006" xmlns:aink="http://schemas.microsoft.com/office/drawing/2016/ink" xmlns:am3d="http://schemas.microsoft.com/office/drawing/2017/model3d" xmlns:o="urn:schemas-microsoft-com:office:office" xmlns:oel="http://schemas.microsoft.com/office/2019/extlst" xmlns:r="http://schemas.openxmlformats.org/officeDocument/2006/relationships" xmlns:m="http://schemas.openxmlformats.org/officeDocument/2006/math" xmlns:v="urn:schemas-microsoft-com:vml" xmlns:wp14="http://schemas.microsoft.com/office/word/2010/wordprocessingDrawing" xmlns:wp="http://schemas.openxmlformats.org/drawingml/2006/wordprocessingDrawing" xmlns:w10="urn:schemas-microsoft-com:office:word" xmlns:w="http://schemas.openxmlformats.org/wordprocessingml/2006/main" xmlns:w14="http://schemas.microsoft.com/office/word/2010/wordml" xmlns:w15="http://schemas.microsoft.com/office/word/2012/wordml" xmlns:w16cex="http://schemas.microsoft.com/office/word/2018/wordml/cex" xmlns:w16cid="http://schemas.microsoft.com/office/word/2016/wordml/cid" xmlns:w16="http://schemas.microsoft.com/office/word/2018/wordml" xmlns:w16sdtdh="http://schemas.microsoft.com/office/word/2020/wordml/sdtdatahash" xmlns:w16se="http://schemas.microsoft.com/office/word/2015/wordml/symex" xmlns:wpg="http://schemas.microsoft.com/office/word/2010/wordprocessingGroup" xmlns:wpi="http://schemas.microsoft.com/office/word/2010/wordprocessingInk" xmlns:wne="http://schemas.microsoft.com/office/word/2006/wordml" xmlns:wps="http://schemas.microsoft.com/office/word/2010/wordprocessingShape" mc:Ignorable="w14 w15 w16se w16cid w16 w16cex w16sdtdh wp14">
+<w:document xmlns:wpc="http://schemas.microsoft.com/office/word/2010/wordprocessingCanvas" xmlns:cx="http://schemas.microsoft.com/office/drawing/2014/chartex" xmlns:cx1="http://schemas.microsoft.com/office/drawing/2015/9/8/chartex" xmlns:cx2="http://schemas.microsoft.com/office/drawing/2015/10/21/chartex" xmlns:cx3="http://schemas.microsoft.com/office/drawing/2016/5/9/chartex" xmlns:cx4="http://schemas.microsoft.com/office/drawing/2016/5/10/chartex" xmlns:cx5="http://schemas.microsoft.com/office/drawing/2016/5/11/chartex" xmlns:cx6="http://schemas.microsoft.com/office/drawing/2016/5/12/chartex" xmlns:cx7="http://schemas.microsoft.com/office/drawing/2016/5/13/chartex" xmlns:cx8="http://schemas.microsoft.com/office/drawing/2016/5/14/chartex" xmlns:mc="http://schemas.openxmlformats.org/markup-compatibility/2006" xmlns:aink="http://schemas.microsoft.com/office/drawing/2016/ink" xmlns:am3d="http://schemas.microsoft.com/office/drawing/2017/model3d" xmlns:o="urn:schemas-microsoft-com:office:office" xmlns:oel="http://schemas.microsoft.com/office/2019/extlst" xmlns:r="http://schemas.openxmlformats.org/officeDocument/2006/relationships" xmlns:m="http://schemas.openxmlformats.org/officeDocument/2006/math" xmlns:v="urn:schemas-microsoft-com:vml" xmlns:wp14="http://schemas.microsoft.com/office/word/2010/wordprocessingDrawing" xmlns:wp="http://schemas.openxmlformats.org/drawingml/2006/wordprocessingDrawing" xmlns:w10="urn:schemas-microsoft-com:office:word" xmlns:w="http://schemas.openxmlformats.org/wordprocessingml/2006/main" xmlns:w14="http://schemas.microsoft.com/office/word/2010/wordml" xmlns:w15="http://schemas.microsoft.com/office/word/2012/wordml" xmlns:w16cex="http://schemas.microsoft.com/office/word/2018/wordml/cex" xmlns:w16cid="http://schemas.microsoft.com/office/word/2016/wordml/cid" xmlns:w16="http://schemas.microsoft.com/office/word/2018/wordml" xmlns:w16du="http://schemas.microsoft.com/office/word/2023/wordml/word16du" xmlns:w16sdtdh="http://schemas.microsoft.com/office/word/2020/wordml/sdtdatahash" xmlns:w16sdtfl="http://schemas.microsoft.com/office/word/2024/wordml/sdtformatlock" xmlns:w16se="http://schemas.microsoft.com/office/word/2015/wordml/symex" xmlns:wpg="http://schemas.microsoft.com/office/word/2010/wordprocessingGroup" xmlns:wpi="http://schemas.microsoft.com/office/word/2010/wordprocessingInk" xmlns:wne="http://schemas.microsoft.com/office/word/2006/wordml" xmlns:wps="http://schemas.microsoft.com/office/word/2010/wordprocessingShape" mc:Ignorable="w14 w15 w16se w16cid w16 w16cex w16sdtdh w16sdtfl w16du wp14">
   <w:body>
     <w:p>
       <w:pPr>
@@ -62,7 +62,7 @@
             <v:path o:extrusionok="f" gradientshapeok="t" o:connecttype="rect"/>
             <o:lock v:ext="edit" aspectratio="t"/>
           </v:shapetype>
-          <v:shape id="_x0000_i1025" type="#_x0000_t75" style="width:304.5pt;height:235.5pt">
+          <v:shape id="_x0000_i1034" type="#_x0000_t75" style="width:304.5pt;height:235.5pt">
             <v:imagedata r:id="rId5" o:title=""/>
           </v:shape>
         </w:pict>
@@ -102,7 +102,7 @@
             </v:handles>
             <o:callout v:ext="edit" on="t"/>
           </v:shapetype>
-          <v:shape id="_x0000_s1029" type="#_x0000_t48" style="position:absolute;margin-left:252.8pt;margin-top:93.05pt;width:1in;height:78.35pt;z-index:1" adj="-57360,-17492,-29385,2481,,2481,-47130,-19202">
+          <v:shape id="_x0000_s1029" type="#_x0000_t48" style="position:absolute;margin-left:252.8pt;margin-top:93.05pt;width:1in;height:78.35pt;z-index:251657728" adj="-57360,-17492,-29385,2481,,2481,-47130,-19202">
             <v:textbox style="mso-next-textbox:#_x0000_s1029">
               <w:txbxContent>
                 <w:p>
@@ -120,7 +120,7 @@
           <w:noProof/>
         </w:rPr>
         <w:pict w14:anchorId="1818B53F">
-          <v:shape id="Picture 1" o:spid="_x0000_i1026" type="#_x0000_t75" style="width:207pt;height:153.75pt;visibility:visible;mso-wrap-style:square">
+          <v:shape id="_x0000_i1035" type="#_x0000_t75" style="width:207pt;height:153.75pt;visibility:visible;mso-wrap-style:square">
             <v:imagedata r:id="rId6" o:title=""/>
           </v:shape>
         </w:pict>
@@ -163,7 +163,7 @@
           <w:noProof/>
         </w:rPr>
         <w:pict w14:anchorId="02719CB4">
-          <v:shape id="_x0000_i1027" type="#_x0000_t75" style="width:293.25pt;height:372.75pt;visibility:visible;mso-wrap-style:square">
+          <v:shape id="_x0000_i1036" type="#_x0000_t75" style="width:293.25pt;height:372.75pt;visibility:visible;mso-wrap-style:square">
             <v:imagedata r:id="rId7" o:title=""/>
           </v:shape>
         </w:pict>
@@ -256,7 +256,6 @@
           <w:rFonts w:cs="Verdana"/>
           <w:color w:val="24292E"/>
         </w:rPr>
-        <w:lastRenderedPageBreak/>
         <w:t>BirdsNeighbourDistance = 25: Max distance for other birds to be considered in the same flock as others</w:t>
       </w:r>
     </w:p>
@@ -403,6 +402,33 @@
     </w:p>
     <w:p>
       <w:pPr>
+        <w:numPr>
+          <w:ilvl w:val="0"/>
+          <w:numId w:val="5"/>
+        </w:numPr>
+      </w:pPr>
+      <w:r>
+        <w:t>Birds-stats or /118 stats</w:t>
+      </w:r>
+      <w:r>
+        <w:br/>
+        <w:t xml:space="preserve">Shows the </w:t>
+      </w:r>
+      <w:proofErr w:type="gramStart"/>
+      <w:r>
+        <w:t>current status</w:t>
+      </w:r>
+      <w:proofErr w:type="gramEnd"/>
+      <w:r>
+        <w:t xml:space="preserve"> of the birds</w:t>
+      </w:r>
+    </w:p>
+    <w:p>
+      <w:pPr>
+        <w:numPr>
+          <w:ilvl w:val="0"/>
+          <w:numId w:val="5"/>
+        </w:numPr>
         <w:rPr>
           <w:rFonts w:cs="Verdana"/>
         </w:rPr>
@@ -429,6 +455,10 @@
     </w:p>
     <w:p>
       <w:pPr>
+        <w:numPr>
+          <w:ilvl w:val="0"/>
+          <w:numId w:val="5"/>
+        </w:numPr>
         <w:rPr>
           <w:rFonts w:cs="Verdana"/>
         </w:rPr>
@@ -455,6 +485,10 @@
     </w:p>
     <w:p>
       <w:pPr>
+        <w:numPr>
+          <w:ilvl w:val="0"/>
+          <w:numId w:val="5"/>
+        </w:numPr>
         <w:rPr>
           <w:rFonts w:cs="Verdana"/>
         </w:rPr>
@@ -475,6 +509,10 @@
     </w:p>
     <w:p>
       <w:pPr>
+        <w:numPr>
+          <w:ilvl w:val="0"/>
+          <w:numId w:val="5"/>
+        </w:numPr>
         <w:rPr>
           <w:rFonts w:cs="Verdana"/>
         </w:rPr>
@@ -495,6 +533,10 @@
     </w:p>
     <w:p>
       <w:pPr>
+        <w:numPr>
+          <w:ilvl w:val="0"/>
+          <w:numId w:val="5"/>
+        </w:numPr>
         <w:rPr>
           <w:rFonts w:cs="Verdana"/>
         </w:rPr>
@@ -508,6 +550,10 @@
     </w:p>
     <w:p>
       <w:pPr>
+        <w:numPr>
+          <w:ilvl w:val="0"/>
+          <w:numId w:val="5"/>
+        </w:numPr>
         <w:rPr>
           <w:rFonts w:cs="Verdana"/>
         </w:rPr>
@@ -552,6 +598,10 @@
     </w:p>
     <w:p>
       <w:pPr>
+        <w:numPr>
+          <w:ilvl w:val="0"/>
+          <w:numId w:val="5"/>
+        </w:numPr>
         <w:rPr>
           <w:rFonts w:cs="Verdana"/>
         </w:rPr>
@@ -565,6 +615,10 @@
     </w:p>
     <w:p>
       <w:pPr>
+        <w:numPr>
+          <w:ilvl w:val="0"/>
+          <w:numId w:val="5"/>
+        </w:numPr>
         <w:rPr>
           <w:rFonts w:cs="Verdana"/>
         </w:rPr>
@@ -603,6 +657,10 @@
     </w:p>
     <w:p>
       <w:pPr>
+        <w:numPr>
+          <w:ilvl w:val="0"/>
+          <w:numId w:val="5"/>
+        </w:numPr>
         <w:rPr>
           <w:rFonts w:cs="Verdana"/>
         </w:rPr>
@@ -635,15 +693,18 @@
     </w:p>
     <w:p>
       <w:pPr>
-        <w:rPr>
-          <w:rFonts w:cs="Verdana"/>
-        </w:rPr>
-      </w:pPr>
-      <w:r>
-        <w:rPr>
-          <w:rFonts w:cs="Verdana"/>
-        </w:rPr>
-        <w:lastRenderedPageBreak/>
+        <w:numPr>
+          <w:ilvl w:val="0"/>
+          <w:numId w:val="5"/>
+        </w:numPr>
+        <w:rPr>
+          <w:rFonts w:cs="Verdana"/>
+        </w:rPr>
+      </w:pPr>
+      <w:r>
+        <w:rPr>
+          <w:rFonts w:cs="Verdana"/>
+        </w:rPr>
         <w:t>birds-force</w:t>
       </w:r>
       <w:r>
@@ -668,6 +729,10 @@
     </w:p>
     <w:p>
       <w:pPr>
+        <w:numPr>
+          <w:ilvl w:val="0"/>
+          <w:numId w:val="5"/>
+        </w:numPr>
         <w:rPr>
           <w:rFonts w:cs="Verdana"/>
         </w:rPr>
@@ -695,19 +760,15 @@
           <w:rFonts w:cs="Verdana"/>
         </w:rPr>
         <w:br/>
-        <w:t xml:space="preserve">change the maximum distance that other birds are to be considered in the same flock as </w:t>
-      </w:r>
-      <w:proofErr w:type="gramStart"/>
-      <w:r>
-        <w:rPr>
-          <w:rFonts w:cs="Verdana"/>
-        </w:rPr>
-        <w:t>us</w:t>
-      </w:r>
-      <w:proofErr w:type="gramEnd"/>
-    </w:p>
-    <w:p>
-      <w:pPr>
+        <w:t>change the maximum distance that other birds are to be considered in the same flock as us</w:t>
+      </w:r>
+    </w:p>
+    <w:p>
+      <w:pPr>
+        <w:numPr>
+          <w:ilvl w:val="0"/>
+          <w:numId w:val="5"/>
+        </w:numPr>
         <w:rPr>
           <w:rFonts w:cs="Verdana"/>
         </w:rPr>
@@ -740,6 +801,10 @@
     </w:p>
     <w:p>
       <w:pPr>
+        <w:numPr>
+          <w:ilvl w:val="0"/>
+          <w:numId w:val="5"/>
+        </w:numPr>
         <w:rPr>
           <w:rFonts w:cs="Verdana"/>
           <w:color w:val="24292E"/>
@@ -768,7 +833,35 @@
           <w:rFonts w:cs="Verdana"/>
         </w:rPr>
         <w:br/>
-        <w:t xml:space="preserve">sets how close to the edges of things can we get without being worried. If distance is less than </w:t>
+        <w:t xml:space="preserve">sets how close to the edges of things </w:t>
+      </w:r>
+      <w:proofErr w:type="gramStart"/>
+      <w:r>
+        <w:rPr>
+          <w:rFonts w:cs="Verdana"/>
+        </w:rPr>
+        <w:t>can we</w:t>
+      </w:r>
+      <w:proofErr w:type="gramEnd"/>
+      <w:r>
+        <w:rPr>
+          <w:rFonts w:cs="Verdana"/>
+        </w:rPr>
+        <w:t xml:space="preserve"> get without being worried. If </w:t>
+      </w:r>
+      <w:proofErr w:type="gramStart"/>
+      <w:r>
+        <w:rPr>
+          <w:rFonts w:cs="Verdana"/>
+        </w:rPr>
+        <w:t>distance</w:t>
+      </w:r>
+      <w:proofErr w:type="gramEnd"/>
+      <w:r>
+        <w:rPr>
+          <w:rFonts w:cs="Verdana"/>
+        </w:rPr>
+        <w:t xml:space="preserve"> is less than </w:t>
       </w:r>
       <w:r>
         <w:rPr>
@@ -826,79 +919,63 @@
     </w:p>
     <w:p>
       <w:r>
-        <w:t xml:space="preserve">Any currently rezzed in-scene-object can </w:t>
+        <w:t xml:space="preserve">Any currently rezzed in-scene-object can be used as the bird prim. </w:t>
+      </w:r>
+      <w:r>
+        <w:t>However,</w:t>
+      </w:r>
+      <w:r>
+        <w:t xml:space="preserve"> fps is very much affected by the complexity of the entity to use. It is easier to throw a single prim (or sculpty) around the scene than it is to throw the constituent parts of a 200 linked prim dragon.</w:t>
+      </w:r>
+    </w:p>
+    <w:p>
+      <w:r>
+        <w:t>Tests show that &lt;= 500 single prims can be flocked effectively - depending on system and network.   However maybe &lt;= 300 simple linksets can perform as well.</w:t>
+      </w:r>
+    </w:p>
+    <w:p>
+      <w:pPr>
+        <w:pStyle w:val="Heading2"/>
+      </w:pPr>
+      <w:r>
+        <w:t>Network Traffic</w:t>
+      </w:r>
+    </w:p>
+    <w:p>
+      <w:r>
+        <w:t xml:space="preserve">I tested the amount of network traffic generated by bird updates. 20 birds (each with 4 linked prims) </w:t>
+      </w:r>
+      <w:r>
+        <w:t>take</w:t>
+      </w:r>
+      <w:r>
+        <w:t xml:space="preserve"> up about 300kbps in network position updates. 50 of the same birds generates about 750kbps traffic. Each bird uses roughly 15kbps of network traffic. This is all measured using an update framerate of 1, </w:t>
+      </w:r>
+      <w:r>
+        <w:t>i.e.,</w:t>
+      </w:r>
+      <w:r>
+        <w:t xml:space="preserve"> birds' position is updated every simulator frame.</w:t>
+      </w:r>
+    </w:p>
+    <w:p>
+      <w:pPr>
+        <w:pStyle w:val="Heading2"/>
+      </w:pPr>
+      <w:r>
+        <w:t>Statistics</w:t>
+      </w:r>
+    </w:p>
+    <w:p>
+      <w:r>
+        <w:t xml:space="preserve">The stats command in-world or via script returns data to BirdsChatChannel. The console command returns stats to the console. All the </w:t>
       </w:r>
       <w:proofErr w:type="gramStart"/>
       <w:r>
-        <w:t>be used</w:t>
+        <w:t>modules</w:t>
       </w:r>
       <w:proofErr w:type="gramEnd"/>
       <w:r>
-        <w:t xml:space="preserve"> as the bird prim. </w:t>
-      </w:r>
-      <w:r>
-        <w:t>However,</w:t>
-      </w:r>
-      <w:r>
-        <w:t xml:space="preserve"> fps is very much affected by the complexity of the entity to use. It is easier to throw a single prim (or sculpty) around the scene than it is to throw the constituent parts of a 200 linked prim dragon.</w:t>
-      </w:r>
-    </w:p>
-    <w:p>
-      <w:r>
-        <w:t>Tests show that &lt;= 500 single prims can be flocked effectively - depending on system and network.   However maybe &lt;= 300 simple linksets can perform as well.</w:t>
-      </w:r>
-    </w:p>
-    <w:p>
-      <w:pPr>
-        <w:pStyle w:val="Heading2"/>
-      </w:pPr>
-      <w:r>
-        <w:t>Network Traffic</w:t>
-      </w:r>
-    </w:p>
-    <w:p>
-      <w:r>
-        <w:t xml:space="preserve">I tested the amount of network traffic generated by bird updates. 20 birds (each with 4 linked prims) </w:t>
-      </w:r>
-      <w:r>
-        <w:t>take</w:t>
-      </w:r>
-      <w:r>
-        <w:t xml:space="preserve"> up about 300kbps in network position updates. 50 of the same birds generates about 750kbps traffic. Each bird uses roughly 15kbps of network traffic. This is all measured using an update framerate of </w:t>
-      </w:r>
-      <w:proofErr w:type="gramStart"/>
-      <w:r>
-        <w:t>1</w:t>
-      </w:r>
-      <w:proofErr w:type="gramEnd"/>
-      <w:r>
-        <w:t xml:space="preserve">, </w:t>
-      </w:r>
-      <w:r>
-        <w:t>i.e.,</w:t>
-      </w:r>
-      <w:r>
-        <w:t xml:space="preserve"> birds' position is updated every simulator frame.</w:t>
-      </w:r>
-    </w:p>
-    <w:p>
-      <w:pPr>
-        <w:pStyle w:val="Heading2"/>
-      </w:pPr>
-      <w:r>
-        <w:t>Statistics</w:t>
-      </w:r>
-    </w:p>
-    <w:p>
-      <w:r>
-        <w:t xml:space="preserve">The stats command in-world or via script returns data to BirdsChatChannel. The console command returns stats to the console. All the </w:t>
-      </w:r>
-      <w:proofErr w:type="gramStart"/>
-      <w:r>
-        <w:t>modules</w:t>
-      </w:r>
-      <w:proofErr w:type="gramEnd"/>
-      <w:r>
         <w:t xml:space="preserve"> parameters are returned including a list of the active bird prims currently rezzed in the region, and the UUIDs of those prims' root prim. Also included is a list of any avatar UUIDs that may be sitting on those prims. </w:t>
       </w:r>
     </w:p>
@@ -909,7 +986,11 @@
     </w:p>
     <w:p>
       <w:r>
-        <w:lastRenderedPageBreak/>
+        <w:t>birds-stats (or /118 stats</w:t>
+      </w:r>
+    </w:p>
+    <w:p>
+      <w:r>
         <w:t>birds-started = False</w:t>
       </w:r>
       <w:r>
@@ -997,33 +1078,9 @@
         <w:t>birds-prim1 = OpenSimBirds1: af85996d-af4d-4dda-bc89-721c51e09d0c :</w:t>
       </w:r>
     </w:p>
-    <w:p>
-      <w:pPr>
-        <w:rPr>
-          <w:b/>
-          <w:bCs/>
-        </w:rPr>
-      </w:pPr>
-      <w:r>
-        <w:rPr>
-          <w:b/>
-          <w:bCs/>
-        </w:rPr>
-        <w:t>Links:</w:t>
-      </w:r>
-    </w:p>
-    <w:p>
-      <w:hyperlink r:id="rId8" w:history="1">
-        <w:r>
-          <w:rPr>
-            <w:rStyle w:val="Hyperlink"/>
-          </w:rPr>
-          <w:t>https://github.com/JakDaniels/OpenSimBirds</w:t>
-        </w:r>
-      </w:hyperlink>
-      <w:bookmarkEnd w:id="0"/>
-      <w:bookmarkEnd w:id="1"/>
-    </w:p>
+    <w:bookmarkEnd w:id="0"/>
+    <w:bookmarkEnd w:id="1"/>
+    <w:p/>
     <w:sectPr>
       <w:pgSz w:w="12240" w:h="15840"/>
       <w:pgMar w:top="1440" w:right="1440" w:bottom="1440" w:left="1440" w:header="720" w:footer="720" w:gutter="0"/>
@@ -1035,7 +1092,7 @@
 </file>
 
 <file path=word/numbering.xml><?xml version="1.0" encoding="utf-8"?>
-<w:numbering xmlns:wpc="http://schemas.microsoft.com/office/word/2010/wordprocessingCanvas" xmlns:cx="http://schemas.microsoft.com/office/drawing/2014/chartex" xmlns:cx1="http://schemas.microsoft.com/office/drawing/2015/9/8/chartex" xmlns:cx2="http://schemas.microsoft.com/office/drawing/2015/10/21/chartex" xmlns:cx3="http://schemas.microsoft.com/office/drawing/2016/5/9/chartex" xmlns:cx4="http://schemas.microsoft.com/office/drawing/2016/5/10/chartex" xmlns:cx5="http://schemas.microsoft.com/office/drawing/2016/5/11/chartex" xmlns:cx6="http://schemas.microsoft.com/office/drawing/2016/5/12/chartex" xmlns:cx7="http://schemas.microsoft.com/office/drawing/2016/5/13/chartex" xmlns:cx8="http://schemas.microsoft.com/office/drawing/2016/5/14/chartex" xmlns:mc="http://schemas.openxmlformats.org/markup-compatibility/2006" xmlns:aink="http://schemas.microsoft.com/office/drawing/2016/ink" xmlns:am3d="http://schemas.microsoft.com/office/drawing/2017/model3d" xmlns:o="urn:schemas-microsoft-com:office:office" xmlns:oel="http://schemas.microsoft.com/office/2019/extlst" xmlns:r="http://schemas.openxmlformats.org/officeDocument/2006/relationships" xmlns:m="http://schemas.openxmlformats.org/officeDocument/2006/math" xmlns:v="urn:schemas-microsoft-com:vml" xmlns:wp14="http://schemas.microsoft.com/office/word/2010/wordprocessingDrawing" xmlns:wp="http://schemas.openxmlformats.org/drawingml/2006/wordprocessingDrawing" xmlns:w10="urn:schemas-microsoft-com:office:word" xmlns:w="http://schemas.openxmlformats.org/wordprocessingml/2006/main" xmlns:w14="http://schemas.microsoft.com/office/word/2010/wordml" xmlns:w15="http://schemas.microsoft.com/office/word/2012/wordml" xmlns:w16cex="http://schemas.microsoft.com/office/word/2018/wordml/cex" xmlns:w16cid="http://schemas.microsoft.com/office/word/2016/wordml/cid" xmlns:w16="http://schemas.microsoft.com/office/word/2018/wordml" xmlns:w16sdtdh="http://schemas.microsoft.com/office/word/2020/wordml/sdtdatahash" xmlns:w16se="http://schemas.microsoft.com/office/word/2015/wordml/symex" xmlns:wpg="http://schemas.microsoft.com/office/word/2010/wordprocessingGroup" xmlns:wpi="http://schemas.microsoft.com/office/word/2010/wordprocessingInk" xmlns:wne="http://schemas.microsoft.com/office/word/2006/wordml" xmlns:wps="http://schemas.microsoft.com/office/word/2010/wordprocessingShape" mc:Ignorable="w14 w15 w16se w16cid w16 w16cex w16sdtdh wp14">
+<w:numbering xmlns:wpc="http://schemas.microsoft.com/office/word/2010/wordprocessingCanvas" xmlns:cx="http://schemas.microsoft.com/office/drawing/2014/chartex" xmlns:cx1="http://schemas.microsoft.com/office/drawing/2015/9/8/chartex" xmlns:cx2="http://schemas.microsoft.com/office/drawing/2015/10/21/chartex" xmlns:cx3="http://schemas.microsoft.com/office/drawing/2016/5/9/chartex" xmlns:cx4="http://schemas.microsoft.com/office/drawing/2016/5/10/chartex" xmlns:cx5="http://schemas.microsoft.com/office/drawing/2016/5/11/chartex" xmlns:cx6="http://schemas.microsoft.com/office/drawing/2016/5/12/chartex" xmlns:cx7="http://schemas.microsoft.com/office/drawing/2016/5/13/chartex" xmlns:cx8="http://schemas.microsoft.com/office/drawing/2016/5/14/chartex" xmlns:mc="http://schemas.openxmlformats.org/markup-compatibility/2006" xmlns:aink="http://schemas.microsoft.com/office/drawing/2016/ink" xmlns:am3d="http://schemas.microsoft.com/office/drawing/2017/model3d" xmlns:o="urn:schemas-microsoft-com:office:office" xmlns:oel="http://schemas.microsoft.com/office/2019/extlst" xmlns:r="http://schemas.openxmlformats.org/officeDocument/2006/relationships" xmlns:m="http://schemas.openxmlformats.org/officeDocument/2006/math" xmlns:v="urn:schemas-microsoft-com:vml" xmlns:wp14="http://schemas.microsoft.com/office/word/2010/wordprocessingDrawing" xmlns:wp="http://schemas.openxmlformats.org/drawingml/2006/wordprocessingDrawing" xmlns:w10="urn:schemas-microsoft-com:office:word" xmlns:w="http://schemas.openxmlformats.org/wordprocessingml/2006/main" xmlns:w14="http://schemas.microsoft.com/office/word/2010/wordml" xmlns:w15="http://schemas.microsoft.com/office/word/2012/wordml" xmlns:w16cex="http://schemas.microsoft.com/office/word/2018/wordml/cex" xmlns:w16cid="http://schemas.microsoft.com/office/word/2016/wordml/cid" xmlns:w16="http://schemas.microsoft.com/office/word/2018/wordml" xmlns:w16du="http://schemas.microsoft.com/office/word/2023/wordml/word16du" xmlns:w16sdtdh="http://schemas.microsoft.com/office/word/2020/wordml/sdtdatahash" xmlns:w16sdtfl="http://schemas.microsoft.com/office/word/2024/wordml/sdtformatlock" xmlns:w16se="http://schemas.microsoft.com/office/word/2015/wordml/symex" xmlns:wpg="http://schemas.microsoft.com/office/word/2010/wordprocessingGroup" xmlns:wpi="http://schemas.microsoft.com/office/word/2010/wordprocessingInk" xmlns:wne="http://schemas.microsoft.com/office/word/2006/wordml" xmlns:wps="http://schemas.microsoft.com/office/word/2010/wordprocessingShape" mc:Ignorable="w14 w15 w16se w16cid w16 w16cex w16sdtdh w16sdtfl w16du wp14">
   <w:abstractNum w:abstractNumId="0" w15:restartNumberingAfterBreak="0">
     <w:nsid w:val="06650DBC"/>
     <w:multiLevelType w:val="hybridMultilevel"/>
@@ -1457,6 +1514,119 @@
     </w:lvl>
   </w:abstractNum>
   <w:abstractNum w:abstractNumId="3" w15:restartNumberingAfterBreak="0">
+    <w:nsid w:val="2CC3641E"/>
+    <w:multiLevelType w:val="hybridMultilevel"/>
+    <w:tmpl w:val="200E0686"/>
+    <w:lvl w:ilvl="0" w:tplc="04090001">
+      <w:start w:val="1"/>
+      <w:numFmt w:val="bullet"/>
+      <w:lvlText w:val=""/>
+      <w:lvlJc w:val="left"/>
+      <w:pPr>
+        <w:ind w:left="720" w:hanging="360"/>
+      </w:pPr>
+      <w:rPr>
+        <w:rFonts w:ascii="Symbol" w:hAnsi="Symbol" w:hint="default"/>
+      </w:rPr>
+    </w:lvl>
+    <w:lvl w:ilvl="1" w:tplc="04090003" w:tentative="1">
+      <w:start w:val="1"/>
+      <w:numFmt w:val="bullet"/>
+      <w:lvlText w:val="o"/>
+      <w:lvlJc w:val="left"/>
+      <w:pPr>
+        <w:ind w:left="1440" w:hanging="360"/>
+      </w:pPr>
+      <w:rPr>
+        <w:rFonts w:ascii="Courier New" w:hAnsi="Courier New" w:cs="Courier New" w:hint="default"/>
+      </w:rPr>
+    </w:lvl>
+    <w:lvl w:ilvl="2" w:tplc="04090005" w:tentative="1">
+      <w:start w:val="1"/>
+      <w:numFmt w:val="bullet"/>
+      <w:lvlText w:val=""/>
+      <w:lvlJc w:val="left"/>
+      <w:pPr>
+        <w:ind w:left="2160" w:hanging="360"/>
+      </w:pPr>
+      <w:rPr>
+        <w:rFonts w:ascii="Wingdings" w:hAnsi="Wingdings" w:hint="default"/>
+      </w:rPr>
+    </w:lvl>
+    <w:lvl w:ilvl="3" w:tplc="04090001" w:tentative="1">
+      <w:start w:val="1"/>
+      <w:numFmt w:val="bullet"/>
+      <w:lvlText w:val=""/>
+      <w:lvlJc w:val="left"/>
+      <w:pPr>
+        <w:ind w:left="2880" w:hanging="360"/>
+      </w:pPr>
+      <w:rPr>
+        <w:rFonts w:ascii="Symbol" w:hAnsi="Symbol" w:hint="default"/>
+      </w:rPr>
+    </w:lvl>
+    <w:lvl w:ilvl="4" w:tplc="04090003" w:tentative="1">
+      <w:start w:val="1"/>
+      <w:numFmt w:val="bullet"/>
+      <w:lvlText w:val="o"/>
+      <w:lvlJc w:val="left"/>
+      <w:pPr>
+        <w:ind w:left="3600" w:hanging="360"/>
+      </w:pPr>
+      <w:rPr>
+        <w:rFonts w:ascii="Courier New" w:hAnsi="Courier New" w:cs="Courier New" w:hint="default"/>
+      </w:rPr>
+    </w:lvl>
+    <w:lvl w:ilvl="5" w:tplc="04090005" w:tentative="1">
+      <w:start w:val="1"/>
+      <w:numFmt w:val="bullet"/>
+      <w:lvlText w:val=""/>
+      <w:lvlJc w:val="left"/>
+      <w:pPr>
+        <w:ind w:left="4320" w:hanging="360"/>
+      </w:pPr>
+      <w:rPr>
+        <w:rFonts w:ascii="Wingdings" w:hAnsi="Wingdings" w:hint="default"/>
+      </w:rPr>
+    </w:lvl>
+    <w:lvl w:ilvl="6" w:tplc="04090001" w:tentative="1">
+      <w:start w:val="1"/>
+      <w:numFmt w:val="bullet"/>
+      <w:lvlText w:val=""/>
+      <w:lvlJc w:val="left"/>
+      <w:pPr>
+        <w:ind w:left="5040" w:hanging="360"/>
+      </w:pPr>
+      <w:rPr>
+        <w:rFonts w:ascii="Symbol" w:hAnsi="Symbol" w:hint="default"/>
+      </w:rPr>
+    </w:lvl>
+    <w:lvl w:ilvl="7" w:tplc="04090003" w:tentative="1">
+      <w:start w:val="1"/>
+      <w:numFmt w:val="bullet"/>
+      <w:lvlText w:val="o"/>
+      <w:lvlJc w:val="left"/>
+      <w:pPr>
+        <w:ind w:left="5760" w:hanging="360"/>
+      </w:pPr>
+      <w:rPr>
+        <w:rFonts w:ascii="Courier New" w:hAnsi="Courier New" w:cs="Courier New" w:hint="default"/>
+      </w:rPr>
+    </w:lvl>
+    <w:lvl w:ilvl="8" w:tplc="04090005" w:tentative="1">
+      <w:start w:val="1"/>
+      <w:numFmt w:val="bullet"/>
+      <w:lvlText w:val=""/>
+      <w:lvlJc w:val="left"/>
+      <w:pPr>
+        <w:ind w:left="6480" w:hanging="360"/>
+      </w:pPr>
+      <w:rPr>
+        <w:rFonts w:ascii="Wingdings" w:hAnsi="Wingdings" w:hint="default"/>
+      </w:rPr>
+    </w:lvl>
+  </w:abstractNum>
+  <w:abstractNum w:abstractNumId="4" w15:restartNumberingAfterBreak="0">
     <w:nsid w:val="465A1E71"/>
     <w:multiLevelType w:val="hybridMultilevel"/>
     <w:tmpl w:val="FC84FBDA"/>
@@ -1606,13 +1776,16 @@
     <w:abstractNumId w:val="2"/>
   </w:num>
   <w:num w:numId="4" w16cid:durableId="417099689">
+    <w:abstractNumId w:val="4"/>
+  </w:num>
+  <w:num w:numId="5" w16cid:durableId="2122383383">
     <w:abstractNumId w:val="3"/>
   </w:num>
 </w:numbering>
 </file>
 
 <file path=word/styles.xml><?xml version="1.0" encoding="utf-8"?>
-<w:styles xmlns:mc="http://schemas.openxmlformats.org/markup-compatibility/2006" xmlns:r="http://schemas.openxmlformats.org/officeDocument/2006/relationships" xmlns:w="http://schemas.openxmlformats.org/wordprocessingml/2006/main" xmlns:w14="http://schemas.microsoft.com/office/word/2010/wordml" xmlns:w15="http://schemas.microsoft.com/office/word/2012/wordml" xmlns:w16cex="http://schemas.microsoft.com/office/word/2018/wordml/cex" xmlns:w16cid="http://schemas.microsoft.com/office/word/2016/wordml/cid" xmlns:w16="http://schemas.microsoft.com/office/word/2018/wordml" xmlns:w16sdtdh="http://schemas.microsoft.com/office/word/2020/wordml/sdtdatahash" xmlns:w16se="http://schemas.microsoft.com/office/word/2015/wordml/symex" mc:Ignorable="w14 w15 w16se w16cid w16 w16cex w16sdtdh">
+<w:styles xmlns:mc="http://schemas.openxmlformats.org/markup-compatibility/2006" xmlns:r="http://schemas.openxmlformats.org/officeDocument/2006/relationships" xmlns:w="http://schemas.openxmlformats.org/wordprocessingml/2006/main" xmlns:w14="http://schemas.microsoft.com/office/word/2010/wordml" xmlns:w15="http://schemas.microsoft.com/office/word/2012/wordml" xmlns:w16cex="http://schemas.microsoft.com/office/word/2018/wordml/cex" xmlns:w16cid="http://schemas.microsoft.com/office/word/2016/wordml/cid" xmlns:w16="http://schemas.microsoft.com/office/word/2018/wordml" xmlns:w16du="http://schemas.microsoft.com/office/word/2023/wordml/word16du" xmlns:w16sdtdh="http://schemas.microsoft.com/office/word/2020/wordml/sdtdatahash" xmlns:w16sdtfl="http://schemas.microsoft.com/office/word/2024/wordml/sdtformatlock" xmlns:w16se="http://schemas.microsoft.com/office/word/2015/wordml/symex" mc:Ignorable="w14 w15 w16se w16cid w16 w16cex w16sdtdh w16sdtfl w16du">
   <w:docDefaults>
     <w:rPrDefault>
       <w:rPr>
@@ -2605,6 +2778,18 @@
       <w:outlineLvl w:val="9"/>
     </w:pPr>
   </w:style>
+  <w:style w:type="character" w:styleId="UnresolvedMention">
+    <w:name w:val="Unresolved Mention"/>
+    <w:basedOn w:val="DefaultParagraphFont"/>
+    <w:uiPriority w:val="99"/>
+    <w:semiHidden/>
+    <w:unhideWhenUsed/>
+    <w:rsid w:val="0019341C"/>
+    <w:rPr>
+      <w:color w:val="605E5C"/>
+      <w:shd w:val="clear" w:color="auto" w:fill="E1DFDD"/>
+    </w:rPr>
+  </w:style>
 </w:styles>
 </file>
 

</xml_diff>